<commit_message>
Gizmo sheet: add depth questions and a practice example for each rule
Co-Authored-By: Claude Sonnet 5.5 <noreply@anthropic.com>
Claude-Session: https://claude.ai/code/session_01LaT1EarAMnh5opQoFahNzN
</commit_message>
<xml_diff>
--- a/output/chem-u02/SHULL_CHEM_Activity_U02_S02.3_Gizmo_Rules.docx
+++ b/output/chem-u02/SHULL_CHEM_Activity_U02_S02.3_Gizmo_Rules.docx
@@ -878,6 +878,118 @@
           </w:p>
           <w:p>
             <w:pPr>
+              <w:spacing w:after="40"/>
+              <w:ind w:left="360" w:hanging="360"/>
+            </w:pPr>
+            <w:r>
+              <w:rPr>
+                <w:rFonts w:ascii="Trade Gothic Next" w:hAnsi="Trade Gothic Next"/>
+                <w:b w:val="0"/>
+                <w:color w:val="14161B"/>
+                <w:sz w:val="20"/>
+                <w:u w:val="none"/>
+              </w:rPr>
+              <w:t xml:space="preserve">7   Build phosphorus (P) in the Gizmo and Check it. Electron configuration:  </w:t>
+            </w:r>
+            <w:r>
+              <w:rPr>
+                <w:rFonts w:ascii="Trade Gothic Next" w:hAnsi="Trade Gothic Next"/>
+                <w:b w:val="0"/>
+                <w:color w:val="14161B"/>
+                <w:sz w:val="20"/>
+                <w:u w:val="none"/>
+              </w:rPr>
+              <w:t xml:space="preserve"> ______________________</w:t>
+            </w:r>
+          </w:p>
+          <w:p>
+            <w:pPr>
+              <w:spacing w:after="40"/>
+              <w:ind w:left="360" w:hanging="360"/>
+            </w:pPr>
+            <w:r>
+              <w:rPr>
+                <w:rFonts w:ascii="Trade Gothic Next" w:hAnsi="Trade Gothic Next"/>
+                <w:b w:val="0"/>
+                <w:color w:val="14161B"/>
+                <w:sz w:val="20"/>
+                <w:u w:val="none"/>
+              </w:rPr>
+              <w:t>8   Use what you saw in step 5. In one sentence, explain why potassium's last electron goes in 4s and not in 3d.</w:t>
+            </w:r>
+          </w:p>
+          <w:tbl>
+            <w:tblPr>
+              <w:tblW w:type="auto" w:w="0"/>
+              <w:tblLayout w:type="fixed"/>
+              <w:tblLook w:firstColumn="1" w:firstRow="1" w:lastColumn="0" w:lastRow="0" w:noHBand="0" w:noVBand="1" w:val="04A0"/>
+              <w:tblLayout w:type="fixed"/>
+            </w:tblPr>
+            <w:tblGrid>
+              <w:gridCol w:w="1728"/>
+              <w:gridCol w:w="8640"/>
+            </w:tblGrid>
+            <w:tr>
+              <w:trPr>
+                <w:cantSplit/>
+                <w:trHeight w:val="489" w:hRule="atLeast"/>
+              </w:trPr>
+              <w:tc>
+                <w:tcPr>
+                  <w:tcW w:type="dxa" w:w="1728"/>
+                  <w:vAlign w:val="bottom"/>
+                  <w:tcMar>
+                    <w:top w:w="0" w:type="dxa"/>
+                    <w:left w:w="0" w:type="dxa"/>
+                    <w:bottom w:w="10" w:type="dxa"/>
+                    <w:right w:w="0" w:type="dxa"/>
+                  </w:tcMar>
+                </w:tcPr>
+                <w:p>
+                  <w:pPr>
+                    <w:spacing w:after="0"/>
+                  </w:pPr>
+                  <w:r>
+                    <w:rPr>
+                      <w:rFonts w:ascii="Trade Gothic Next" w:hAnsi="Trade Gothic Next"/>
+                      <w:b/>
+                      <w:color w:val="14161B"/>
+                      <w:sz w:val="18"/>
+                      <w:u w:val="none"/>
+                    </w:rPr>
+                    <w:t>My explanation</w:t>
+                  </w:r>
+                </w:p>
+              </w:tc>
+              <w:tc>
+                <w:tcPr>
+                  <w:tcW w:type="dxa" w:w="8640"/>
+                  <w:vAlign w:val="bottom"/>
+                  <w:tcMar>
+                    <w:top w:w="0" w:type="dxa"/>
+                    <w:left w:w="0" w:type="dxa"/>
+                    <w:bottom w:w="10" w:type="dxa"/>
+                    <w:right w:w="0" w:type="dxa"/>
+                  </w:tcMar>
+                  <w:tcBorders>
+                    <w:bottom w:val="single" w:sz="6" w:color="C8CDC2"/>
+                  </w:tcBorders>
+                </w:tcPr>
+                <w:p>
+                  <w:pPr>
+                    <w:spacing w:after="0"/>
+                  </w:pPr>
+                </w:p>
+              </w:tc>
+            </w:tr>
+          </w:tbl>
+          <w:p>
+            <w:pPr>
+              <w:spacing w:before="0" w:after="0" w:line="20" w:lineRule="exact"/>
+            </w:pPr>
+          </w:p>
+          <w:p>
+            <w:pPr>
               <w:spacing w:before="0" w:after="0" w:line="60" w:lineRule="exact"/>
             </w:pPr>
             <w:r>
@@ -1174,6 +1286,118 @@
             <w:pPr>
               <w:spacing w:before="0" w:after="0" w:line="20" w:lineRule="exact"/>
             </w:pPr>
+          </w:p>
+          <w:p>
+            <w:pPr>
+              <w:spacing w:after="40"/>
+              <w:ind w:left="360" w:hanging="360"/>
+            </w:pPr>
+            <w:r>
+              <w:rPr>
+                <w:rFonts w:ascii="Trade Gothic Next" w:hAnsi="Trade Gothic Next"/>
+                <w:b w:val="0"/>
+                <w:color w:val="14161B"/>
+                <w:sz w:val="20"/>
+                <w:u w:val="none"/>
+              </w:rPr>
+              <w:t xml:space="preserve">3   Select Ne and fill it. The 2p subshell has  </w:t>
+            </w:r>
+            <w:r>
+              <w:rPr>
+                <w:rFonts w:ascii="Trade Gothic Next" w:hAnsi="Trade Gothic Next"/>
+                <w:b w:val="0"/>
+                <w:color w:val="14161B"/>
+                <w:sz w:val="20"/>
+                <w:u w:val="none"/>
+              </w:rPr>
+              <w:t xml:space="preserve"> ______ </w:t>
+            </w:r>
+            <w:r>
+              <w:rPr>
+                <w:rFonts w:ascii="Trade Gothic Next" w:hAnsi="Trade Gothic Next"/>
+                <w:b w:val="0"/>
+                <w:color w:val="14161B"/>
+                <w:sz w:val="20"/>
+                <w:u w:val="none"/>
+              </w:rPr>
+              <w:t xml:space="preserve">  boxes and holds  </w:t>
+            </w:r>
+            <w:r>
+              <w:rPr>
+                <w:rFonts w:ascii="Trade Gothic Next" w:hAnsi="Trade Gothic Next"/>
+                <w:b w:val="0"/>
+                <w:color w:val="14161B"/>
+                <w:sz w:val="20"/>
+                <w:u w:val="none"/>
+              </w:rPr>
+              <w:t xml:space="preserve"> ______ </w:t>
+            </w:r>
+            <w:r>
+              <w:rPr>
+                <w:rFonts w:ascii="Trade Gothic Next" w:hAnsi="Trade Gothic Next"/>
+                <w:b w:val="0"/>
+                <w:color w:val="14161B"/>
+                <w:sz w:val="20"/>
+                <w:u w:val="none"/>
+              </w:rPr>
+              <w:t xml:space="preserve">  electrons in total. Divide: that is  </w:t>
+            </w:r>
+            <w:r>
+              <w:rPr>
+                <w:rFonts w:ascii="Trade Gothic Next" w:hAnsi="Trade Gothic Next"/>
+                <w:b w:val="0"/>
+                <w:color w:val="14161B"/>
+                <w:sz w:val="20"/>
+                <w:u w:val="none"/>
+              </w:rPr>
+              <w:t xml:space="preserve"> ______ </w:t>
+            </w:r>
+            <w:r>
+              <w:rPr>
+                <w:rFonts w:ascii="Trade Gothic Next" w:hAnsi="Trade Gothic Next"/>
+                <w:b w:val="0"/>
+                <w:color w:val="14161B"/>
+                <w:sz w:val="20"/>
+                <w:u w:val="none"/>
+              </w:rPr>
+              <w:t xml:space="preserve">  electrons in each box.</w:t>
+            </w:r>
+          </w:p>
+          <w:p>
+            <w:pPr>
+              <w:spacing w:after="40"/>
+              <w:ind w:left="360" w:hanging="360"/>
+            </w:pPr>
+            <w:r>
+              <w:rPr>
+                <w:rFonts w:ascii="Trade Gothic Next" w:hAnsi="Trade Gothic Next"/>
+                <w:b w:val="0"/>
+                <w:color w:val="14161B"/>
+                <w:sz w:val="20"/>
+                <w:u w:val="none"/>
+              </w:rPr>
+              <w:t xml:space="preserve">4   Predict, then try it. The 3d subshell has 5 boxes. The most electrons it can hold is  </w:t>
+            </w:r>
+            <w:r>
+              <w:rPr>
+                <w:rFonts w:ascii="Trade Gothic Next" w:hAnsi="Trade Gothic Next"/>
+                <w:b w:val="0"/>
+                <w:color w:val="14161B"/>
+                <w:sz w:val="20"/>
+                <w:u w:val="none"/>
+              </w:rPr>
+              <w:t xml:space="preserve"> ______</w:t>
+            </w:r>
+            <w:r>
+              <w:rPr>
+                <w:rFonts w:ascii="Trade Gothic Next" w:hAnsi="Trade Gothic Next"/>
+                <w:b w:val="0"/>
+                <w:color w:val="14161B"/>
+                <w:sz w:val="20"/>
+                <w:u w:val="none"/>
+              </w:rPr>
+              <w:t>.  Click a few 3d boxes in the Gizmo to see the arrows.</w:t>
+            </w:r>
           </w:p>
           <w:p>
             <w:pPr>
@@ -3496,6 +3720,178 @@
           </w:p>
           <w:p>
             <w:pPr>
+              <w:spacing w:after="40"/>
+              <w:ind w:left="360" w:hanging="360"/>
+            </w:pPr>
+            <w:r>
+              <w:rPr>
+                <w:rFonts w:ascii="Trade Gothic Next" w:hAnsi="Trade Gothic Next"/>
+                <w:b w:val="0"/>
+                <w:color w:val="14161B"/>
+                <w:sz w:val="20"/>
+                <w:u w:val="none"/>
+              </w:rPr>
+              <w:t xml:space="preserve">4   Count the unpaired electrons (single arrows) in the 2p boxes:  N  </w:t>
+            </w:r>
+            <w:r>
+              <w:rPr>
+                <w:rFonts w:ascii="Trade Gothic Next" w:hAnsi="Trade Gothic Next"/>
+                <w:b w:val="0"/>
+                <w:color w:val="14161B"/>
+                <w:sz w:val="20"/>
+                <w:u w:val="none"/>
+              </w:rPr>
+              <w:t xml:space="preserve"> ______ </w:t>
+            </w:r>
+            <w:r>
+              <w:rPr>
+                <w:rFonts w:ascii="Trade Gothic Next" w:hAnsi="Trade Gothic Next"/>
+                <w:b w:val="0"/>
+                <w:color w:val="14161B"/>
+                <w:sz w:val="20"/>
+                <w:u w:val="none"/>
+              </w:rPr>
+              <w:t xml:space="preserve">     O  </w:t>
+            </w:r>
+            <w:r>
+              <w:rPr>
+                <w:rFonts w:ascii="Trade Gothic Next" w:hAnsi="Trade Gothic Next"/>
+                <w:b w:val="0"/>
+                <w:color w:val="14161B"/>
+                <w:sz w:val="20"/>
+                <w:u w:val="none"/>
+              </w:rPr>
+              <w:t xml:space="preserve"> ______ </w:t>
+            </w:r>
+            <w:r>
+              <w:rPr>
+                <w:rFonts w:ascii="Trade Gothic Next" w:hAnsi="Trade Gothic Next"/>
+                <w:b w:val="0"/>
+                <w:color w:val="14161B"/>
+                <w:sz w:val="20"/>
+                <w:u w:val="none"/>
+              </w:rPr>
+              <w:t xml:space="preserve">     F  </w:t>
+            </w:r>
+            <w:r>
+              <w:rPr>
+                <w:rFonts w:ascii="Trade Gothic Next" w:hAnsi="Trade Gothic Next"/>
+                <w:b w:val="0"/>
+                <w:color w:val="14161B"/>
+                <w:sz w:val="20"/>
+                <w:u w:val="none"/>
+              </w:rPr>
+              <w:t xml:space="preserve"> ______ </w:t>
+            </w:r>
+            <w:r>
+              <w:rPr>
+                <w:rFonts w:ascii="Trade Gothic Next" w:hAnsi="Trade Gothic Next"/>
+                <w:b w:val="0"/>
+                <w:color w:val="14161B"/>
+                <w:sz w:val="20"/>
+                <w:u w:val="none"/>
+              </w:rPr>
+              <w:t xml:space="preserve">     Ne  </w:t>
+            </w:r>
+            <w:r>
+              <w:rPr>
+                <w:rFonts w:ascii="Trade Gothic Next" w:hAnsi="Trade Gothic Next"/>
+                <w:b w:val="0"/>
+                <w:color w:val="14161B"/>
+                <w:sz w:val="20"/>
+                <w:u w:val="none"/>
+              </w:rPr>
+              <w:t xml:space="preserve"> ______</w:t>
+            </w:r>
+          </w:p>
+          <w:p>
+            <w:pPr>
+              <w:spacing w:after="40"/>
+              <w:ind w:left="360" w:hanging="360"/>
+            </w:pPr>
+            <w:r>
+              <w:rPr>
+                <w:rFonts w:ascii="Trade Gothic Next" w:hAnsi="Trade Gothic Next"/>
+                <w:b w:val="0"/>
+                <w:color w:val="14161B"/>
+                <w:sz w:val="20"/>
+                <w:u w:val="none"/>
+              </w:rPr>
+              <w:t>5   Why does the number of unpaired electrons go down after nitrogen?</w:t>
+            </w:r>
+          </w:p>
+          <w:tbl>
+            <w:tblPr>
+              <w:tblW w:type="auto" w:w="0"/>
+              <w:tblLayout w:type="fixed"/>
+              <w:tblLook w:firstColumn="1" w:firstRow="1" w:lastColumn="0" w:lastRow="0" w:noHBand="0" w:noVBand="1" w:val="04A0"/>
+              <w:tblLayout w:type="fixed"/>
+            </w:tblPr>
+            <w:tblGrid>
+              <w:gridCol w:w="1728"/>
+              <w:gridCol w:w="8640"/>
+            </w:tblGrid>
+            <w:tr>
+              <w:trPr>
+                <w:cantSplit/>
+                <w:trHeight w:val="489" w:hRule="atLeast"/>
+              </w:trPr>
+              <w:tc>
+                <w:tcPr>
+                  <w:tcW w:type="dxa" w:w="1728"/>
+                  <w:vAlign w:val="bottom"/>
+                  <w:tcMar>
+                    <w:top w:w="0" w:type="dxa"/>
+                    <w:left w:w="0" w:type="dxa"/>
+                    <w:bottom w:w="10" w:type="dxa"/>
+                    <w:right w:w="0" w:type="dxa"/>
+                  </w:tcMar>
+                </w:tcPr>
+                <w:p>
+                  <w:pPr>
+                    <w:spacing w:after="0"/>
+                  </w:pPr>
+                  <w:r>
+                    <w:rPr>
+                      <w:rFonts w:ascii="Trade Gothic Next" w:hAnsi="Trade Gothic Next"/>
+                      <w:b/>
+                      <w:color w:val="14161B"/>
+                      <w:sz w:val="18"/>
+                      <w:u w:val="none"/>
+                    </w:rPr>
+                    <w:t>My explanation</w:t>
+                  </w:r>
+                </w:p>
+              </w:tc>
+              <w:tc>
+                <w:tcPr>
+                  <w:tcW w:type="dxa" w:w="8640"/>
+                  <w:vAlign w:val="bottom"/>
+                  <w:tcMar>
+                    <w:top w:w="0" w:type="dxa"/>
+                    <w:left w:w="0" w:type="dxa"/>
+                    <w:bottom w:w="10" w:type="dxa"/>
+                    <w:right w:w="0" w:type="dxa"/>
+                  </w:tcMar>
+                  <w:tcBorders>
+                    <w:bottom w:val="single" w:sz="6" w:color="C8CDC2"/>
+                  </w:tcBorders>
+                </w:tcPr>
+                <w:p>
+                  <w:pPr>
+                    <w:spacing w:after="0"/>
+                  </w:pPr>
+                </w:p>
+              </w:tc>
+            </w:tr>
+          </w:tbl>
+          <w:p>
+            <w:pPr>
+              <w:spacing w:before="0" w:after="0" w:line="20" w:lineRule="exact"/>
+            </w:pPr>
+          </w:p>
+          <w:p>
+            <w:pPr>
               <w:spacing w:before="0" w:after="0" w:line="60" w:lineRule="exact"/>
             </w:pPr>
             <w:r>
@@ -3639,6 +4035,823 @@
             <w:pPr>
               <w:spacing w:before="0" w:after="0" w:line="20" w:lineRule="exact"/>
             </w:pPr>
+          </w:p>
+          <w:p>
+            <w:pPr>
+              <w:spacing w:after="40"/>
+              <w:ind w:left="360" w:hanging="360"/>
+            </w:pPr>
+            <w:r>
+              <w:rPr>
+                <w:rFonts w:ascii="Trade Gothic Next" w:hAnsi="Trade Gothic Next"/>
+                <w:b w:val="0"/>
+                <w:color w:val="14161B"/>
+                <w:sz w:val="20"/>
+                <w:u w:val="none"/>
+              </w:rPr>
+              <w:t>6   Practice. Draw the 3s and 3p boxes for each element first, using all three rules. Then build it in the Gizmo and Check. Correct anything the Gizmo marks wrong.</w:t>
+            </w:r>
+          </w:p>
+          <w:p>
+            <w:pPr>
+              <w:spacing w:before="0" w:after="0" w:line="40" w:lineRule="exact"/>
+            </w:pPr>
+            <w:r>
+              <w:rPr>
+                <w:rFonts w:ascii="Trade Gothic Next" w:hAnsi="Trade Gothic Next"/>
+                <w:sz w:val="2"/>
+              </w:rPr>
+            </w:r>
+          </w:p>
+          <w:tbl>
+            <w:tblPr>
+              <w:tblW w:type="auto" w:w="0"/>
+              <w:tblLayout w:type="fixed"/>
+              <w:tblLook w:firstColumn="1" w:firstRow="1" w:lastColumn="0" w:lastRow="0" w:noHBand="0" w:noVBand="1" w:val="04A0"/>
+              <w:tblLayout w:type="fixed"/>
+            </w:tblPr>
+            <w:tblGrid>
+              <w:gridCol w:w="864"/>
+              <w:gridCol w:w="9216"/>
+            </w:tblGrid>
+            <w:tr>
+              <w:trPr>
+                <w:cantSplit/>
+                <w:trHeight w:val="633" w:hRule="atLeast"/>
+              </w:trPr>
+              <w:tc>
+                <w:tcPr>
+                  <w:tcW w:type="dxa" w:w="864"/>
+                  <w:vAlign w:val="center"/>
+                  <w:tcMar>
+                    <w:top w:w="20" w:type="dxa"/>
+                    <w:left w:w="20" w:type="dxa"/>
+                    <w:bottom w:w="20" w:type="dxa"/>
+                    <w:right w:w="20" w:type="dxa"/>
+                  </w:tcMar>
+                  <w:tcBorders>
+                    <w:bottom w:val="single" w:sz="4" w:color="C8CDC2"/>
+                  </w:tcBorders>
+                </w:tcPr>
+                <w:p>
+                  <w:pPr>
+                    <w:spacing w:after="0"/>
+                  </w:pPr>
+                  <w:r>
+                    <w:rPr>
+                      <w:rFonts w:ascii="Trade Gothic Next" w:hAnsi="Trade Gothic Next"/>
+                      <w:b/>
+                      <w:color w:val="14161B"/>
+                      <w:sz w:val="22"/>
+                      <w:u w:val="none"/>
+                    </w:rPr>
+                    <w:t>P</w:t>
+                  </w:r>
+                </w:p>
+              </w:tc>
+              <w:tc>
+                <w:tcPr>
+                  <w:tcW w:type="dxa" w:w="9216"/>
+                  <w:vAlign w:val="center"/>
+                  <w:tcMar>
+                    <w:top w:w="20" w:type="dxa"/>
+                    <w:left w:w="20" w:type="dxa"/>
+                    <w:bottom w:w="20" w:type="dxa"/>
+                    <w:right w:w="20" w:type="dxa"/>
+                  </w:tcMar>
+                  <w:tcBorders>
+                    <w:bottom w:val="single" w:sz="4" w:color="C8CDC2"/>
+                  </w:tcBorders>
+                </w:tcPr>
+                <w:p>
+                  <w:pPr>
+                    <w:spacing w:before="0" w:after="0" w:line="20" w:lineRule="exact"/>
+                  </w:pPr>
+                </w:p>
+                <w:tbl>
+                  <w:tblPr>
+                    <w:tblW w:type="auto" w:w="0"/>
+                    <w:tblLayout w:type="fixed"/>
+                    <w:tblLook w:firstColumn="1" w:firstRow="1" w:lastColumn="0" w:lastRow="0" w:noHBand="0" w:noVBand="1" w:val="04A0"/>
+                    <w:tblLayout w:type="fixed"/>
+                  </w:tblPr>
+                  <w:tblGrid>
+                    <w:gridCol w:w="490"/>
+                    <w:gridCol w:w="432"/>
+                    <w:gridCol w:w="490"/>
+                    <w:gridCol w:w="432"/>
+                    <w:gridCol w:w="432"/>
+                    <w:gridCol w:w="432"/>
+                  </w:tblGrid>
+                  <w:tr>
+                    <w:trPr>
+                      <w:cantSplit/>
+                      <w:trHeight w:val="489" w:hRule="atLeast"/>
+                    </w:trPr>
+                    <w:tc>
+                      <w:tcPr>
+                        <w:tcW w:type="dxa" w:w="490"/>
+                        <w:vAlign w:val="center"/>
+                        <w:tcMar>
+                          <w:top w:w="0" w:type="dxa"/>
+                          <w:left w:w="0" w:type="dxa"/>
+                          <w:bottom w:w="0" w:type="dxa"/>
+                          <w:right w:w="10" w:type="dxa"/>
+                        </w:tcMar>
+                      </w:tcPr>
+                      <w:p>
+                        <w:pPr>
+                          <w:spacing w:after="0"/>
+                          <w:jc w:val="right"/>
+                        </w:pPr>
+                        <w:r>
+                          <w:rPr>
+                            <w:rFonts w:ascii="Trade Gothic Next" w:hAnsi="Trade Gothic Next"/>
+                            <w:b/>
+                            <w:color w:val="55604F"/>
+                            <w:sz w:val="16"/>
+                            <w:u w:val="none"/>
+                          </w:rPr>
+                          <w:t>3s</w:t>
+                        </w:r>
+                      </w:p>
+                    </w:tc>
+                    <w:tc>
+                      <w:tcPr>
+                        <w:tcW w:type="dxa" w:w="432"/>
+                        <w:tcBorders>
+                          <w:top w:val="single" w:sz="8" w:color="4D730E"/>
+                          <w:left w:val="single" w:sz="8" w:color="4D730E"/>
+                          <w:bottom w:val="single" w:sz="8" w:color="4D730E"/>
+                          <w:right w:val="single" w:sz="8" w:color="4D730E"/>
+                        </w:tcBorders>
+                        <w:vAlign w:val="center"/>
+                        <w:tcMar>
+                          <w:top w:w="0" w:type="dxa"/>
+                          <w:left w:w="0" w:type="dxa"/>
+                          <w:bottom w:w="0" w:type="dxa"/>
+                          <w:right w:w="0" w:type="dxa"/>
+                        </w:tcMar>
+                      </w:tcPr>
+                      <w:p>
+                        <w:pPr>
+                          <w:spacing w:after="0"/>
+                          <w:jc w:val="center"/>
+                        </w:pPr>
+                      </w:p>
+                    </w:tc>
+                    <w:tc>
+                      <w:tcPr>
+                        <w:tcW w:type="dxa" w:w="490"/>
+                        <w:vAlign w:val="center"/>
+                        <w:tcMar>
+                          <w:top w:w="0" w:type="dxa"/>
+                          <w:left w:w="0" w:type="dxa"/>
+                          <w:bottom w:w="0" w:type="dxa"/>
+                          <w:right w:w="10" w:type="dxa"/>
+                        </w:tcMar>
+                      </w:tcPr>
+                      <w:p>
+                        <w:pPr>
+                          <w:spacing w:after="0"/>
+                          <w:jc w:val="right"/>
+                        </w:pPr>
+                        <w:r>
+                          <w:rPr>
+                            <w:rFonts w:ascii="Trade Gothic Next" w:hAnsi="Trade Gothic Next"/>
+                            <w:b/>
+                            <w:color w:val="55604F"/>
+                            <w:sz w:val="16"/>
+                            <w:u w:val="none"/>
+                          </w:rPr>
+                          <w:t>3p</w:t>
+                        </w:r>
+                      </w:p>
+                    </w:tc>
+                    <w:tc>
+                      <w:tcPr>
+                        <w:tcW w:type="dxa" w:w="432"/>
+                        <w:tcBorders>
+                          <w:top w:val="single" w:sz="8" w:color="4D730E"/>
+                          <w:left w:val="single" w:sz="8" w:color="4D730E"/>
+                          <w:bottom w:val="single" w:sz="8" w:color="4D730E"/>
+                          <w:right w:val="single" w:sz="8" w:color="4D730E"/>
+                        </w:tcBorders>
+                        <w:vAlign w:val="center"/>
+                        <w:tcMar>
+                          <w:top w:w="0" w:type="dxa"/>
+                          <w:left w:w="0" w:type="dxa"/>
+                          <w:bottom w:w="0" w:type="dxa"/>
+                          <w:right w:w="0" w:type="dxa"/>
+                        </w:tcMar>
+                      </w:tcPr>
+                      <w:p>
+                        <w:pPr>
+                          <w:spacing w:after="0"/>
+                          <w:jc w:val="center"/>
+                        </w:pPr>
+                      </w:p>
+                    </w:tc>
+                    <w:tc>
+                      <w:tcPr>
+                        <w:tcW w:type="dxa" w:w="432"/>
+                        <w:tcBorders>
+                          <w:top w:val="single" w:sz="8" w:color="4D730E"/>
+                          <w:left w:val="single" w:sz="8" w:color="4D730E"/>
+                          <w:bottom w:val="single" w:sz="8" w:color="4D730E"/>
+                          <w:right w:val="single" w:sz="8" w:color="4D730E"/>
+                        </w:tcBorders>
+                        <w:vAlign w:val="center"/>
+                        <w:tcMar>
+                          <w:top w:w="0" w:type="dxa"/>
+                          <w:left w:w="0" w:type="dxa"/>
+                          <w:bottom w:w="0" w:type="dxa"/>
+                          <w:right w:w="0" w:type="dxa"/>
+                        </w:tcMar>
+                      </w:tcPr>
+                      <w:p>
+                        <w:pPr>
+                          <w:spacing w:after="0"/>
+                          <w:jc w:val="center"/>
+                        </w:pPr>
+                      </w:p>
+                    </w:tc>
+                    <w:tc>
+                      <w:tcPr>
+                        <w:tcW w:type="dxa" w:w="432"/>
+                        <w:tcBorders>
+                          <w:top w:val="single" w:sz="8" w:color="4D730E"/>
+                          <w:left w:val="single" w:sz="8" w:color="4D730E"/>
+                          <w:bottom w:val="single" w:sz="8" w:color="4D730E"/>
+                          <w:right w:val="single" w:sz="8" w:color="4D730E"/>
+                        </w:tcBorders>
+                        <w:vAlign w:val="center"/>
+                        <w:tcMar>
+                          <w:top w:w="0" w:type="dxa"/>
+                          <w:left w:w="0" w:type="dxa"/>
+                          <w:bottom w:w="0" w:type="dxa"/>
+                          <w:right w:w="0" w:type="dxa"/>
+                        </w:tcMar>
+                      </w:tcPr>
+                      <w:p>
+                        <w:pPr>
+                          <w:spacing w:after="0"/>
+                          <w:jc w:val="center"/>
+                        </w:pPr>
+                      </w:p>
+                    </w:tc>
+                  </w:tr>
+                </w:tbl>
+                <w:p>
+                  <w:pPr>
+                    <w:spacing w:before="0" w:after="0" w:line="20" w:lineRule="exact"/>
+                  </w:pPr>
+                </w:p>
+              </w:tc>
+            </w:tr>
+            <w:tr>
+              <w:trPr>
+                <w:cantSplit/>
+                <w:trHeight w:val="633" w:hRule="atLeast"/>
+              </w:trPr>
+              <w:tc>
+                <w:tcPr>
+                  <w:tcW w:type="dxa" w:w="864"/>
+                  <w:vAlign w:val="center"/>
+                  <w:tcMar>
+                    <w:top w:w="20" w:type="dxa"/>
+                    <w:left w:w="20" w:type="dxa"/>
+                    <w:bottom w:w="20" w:type="dxa"/>
+                    <w:right w:w="20" w:type="dxa"/>
+                  </w:tcMar>
+                  <w:tcBorders>
+                    <w:bottom w:val="single" w:sz="4" w:color="C8CDC2"/>
+                  </w:tcBorders>
+                </w:tcPr>
+                <w:p>
+                  <w:pPr>
+                    <w:spacing w:after="0"/>
+                  </w:pPr>
+                  <w:r>
+                    <w:rPr>
+                      <w:rFonts w:ascii="Trade Gothic Next" w:hAnsi="Trade Gothic Next"/>
+                      <w:b/>
+                      <w:color w:val="14161B"/>
+                      <w:sz w:val="22"/>
+                      <w:u w:val="none"/>
+                    </w:rPr>
+                    <w:t>S</w:t>
+                  </w:r>
+                </w:p>
+              </w:tc>
+              <w:tc>
+                <w:tcPr>
+                  <w:tcW w:type="dxa" w:w="9216"/>
+                  <w:vAlign w:val="center"/>
+                  <w:tcMar>
+                    <w:top w:w="20" w:type="dxa"/>
+                    <w:left w:w="20" w:type="dxa"/>
+                    <w:bottom w:w="20" w:type="dxa"/>
+                    <w:right w:w="20" w:type="dxa"/>
+                  </w:tcMar>
+                  <w:tcBorders>
+                    <w:bottom w:val="single" w:sz="4" w:color="C8CDC2"/>
+                  </w:tcBorders>
+                </w:tcPr>
+                <w:p>
+                  <w:pPr>
+                    <w:spacing w:before="0" w:after="0" w:line="20" w:lineRule="exact"/>
+                  </w:pPr>
+                </w:p>
+                <w:tbl>
+                  <w:tblPr>
+                    <w:tblW w:type="auto" w:w="0"/>
+                    <w:tblLayout w:type="fixed"/>
+                    <w:tblLook w:firstColumn="1" w:firstRow="1" w:lastColumn="0" w:lastRow="0" w:noHBand="0" w:noVBand="1" w:val="04A0"/>
+                    <w:tblLayout w:type="fixed"/>
+                  </w:tblPr>
+                  <w:tblGrid>
+                    <w:gridCol w:w="490"/>
+                    <w:gridCol w:w="432"/>
+                    <w:gridCol w:w="490"/>
+                    <w:gridCol w:w="432"/>
+                    <w:gridCol w:w="432"/>
+                    <w:gridCol w:w="432"/>
+                  </w:tblGrid>
+                  <w:tr>
+                    <w:trPr>
+                      <w:cantSplit/>
+                      <w:trHeight w:val="489" w:hRule="atLeast"/>
+                    </w:trPr>
+                    <w:tc>
+                      <w:tcPr>
+                        <w:tcW w:type="dxa" w:w="490"/>
+                        <w:vAlign w:val="center"/>
+                        <w:tcMar>
+                          <w:top w:w="0" w:type="dxa"/>
+                          <w:left w:w="0" w:type="dxa"/>
+                          <w:bottom w:w="0" w:type="dxa"/>
+                          <w:right w:w="10" w:type="dxa"/>
+                        </w:tcMar>
+                      </w:tcPr>
+                      <w:p>
+                        <w:pPr>
+                          <w:spacing w:after="0"/>
+                          <w:jc w:val="right"/>
+                        </w:pPr>
+                        <w:r>
+                          <w:rPr>
+                            <w:rFonts w:ascii="Trade Gothic Next" w:hAnsi="Trade Gothic Next"/>
+                            <w:b/>
+                            <w:color w:val="55604F"/>
+                            <w:sz w:val="16"/>
+                            <w:u w:val="none"/>
+                          </w:rPr>
+                          <w:t>3s</w:t>
+                        </w:r>
+                      </w:p>
+                    </w:tc>
+                    <w:tc>
+                      <w:tcPr>
+                        <w:tcW w:type="dxa" w:w="432"/>
+                        <w:tcBorders>
+                          <w:top w:val="single" w:sz="8" w:color="4D730E"/>
+                          <w:left w:val="single" w:sz="8" w:color="4D730E"/>
+                          <w:bottom w:val="single" w:sz="8" w:color="4D730E"/>
+                          <w:right w:val="single" w:sz="8" w:color="4D730E"/>
+                        </w:tcBorders>
+                        <w:vAlign w:val="center"/>
+                        <w:tcMar>
+                          <w:top w:w="0" w:type="dxa"/>
+                          <w:left w:w="0" w:type="dxa"/>
+                          <w:bottom w:w="0" w:type="dxa"/>
+                          <w:right w:w="0" w:type="dxa"/>
+                        </w:tcMar>
+                      </w:tcPr>
+                      <w:p>
+                        <w:pPr>
+                          <w:spacing w:after="0"/>
+                          <w:jc w:val="center"/>
+                        </w:pPr>
+                      </w:p>
+                    </w:tc>
+                    <w:tc>
+                      <w:tcPr>
+                        <w:tcW w:type="dxa" w:w="490"/>
+                        <w:vAlign w:val="center"/>
+                        <w:tcMar>
+                          <w:top w:w="0" w:type="dxa"/>
+                          <w:left w:w="0" w:type="dxa"/>
+                          <w:bottom w:w="0" w:type="dxa"/>
+                          <w:right w:w="10" w:type="dxa"/>
+                        </w:tcMar>
+                      </w:tcPr>
+                      <w:p>
+                        <w:pPr>
+                          <w:spacing w:after="0"/>
+                          <w:jc w:val="right"/>
+                        </w:pPr>
+                        <w:r>
+                          <w:rPr>
+                            <w:rFonts w:ascii="Trade Gothic Next" w:hAnsi="Trade Gothic Next"/>
+                            <w:b/>
+                            <w:color w:val="55604F"/>
+                            <w:sz w:val="16"/>
+                            <w:u w:val="none"/>
+                          </w:rPr>
+                          <w:t>3p</w:t>
+                        </w:r>
+                      </w:p>
+                    </w:tc>
+                    <w:tc>
+                      <w:tcPr>
+                        <w:tcW w:type="dxa" w:w="432"/>
+                        <w:tcBorders>
+                          <w:top w:val="single" w:sz="8" w:color="4D730E"/>
+                          <w:left w:val="single" w:sz="8" w:color="4D730E"/>
+                          <w:bottom w:val="single" w:sz="8" w:color="4D730E"/>
+                          <w:right w:val="single" w:sz="8" w:color="4D730E"/>
+                        </w:tcBorders>
+                        <w:vAlign w:val="center"/>
+                        <w:tcMar>
+                          <w:top w:w="0" w:type="dxa"/>
+                          <w:left w:w="0" w:type="dxa"/>
+                          <w:bottom w:w="0" w:type="dxa"/>
+                          <w:right w:w="0" w:type="dxa"/>
+                        </w:tcMar>
+                      </w:tcPr>
+                      <w:p>
+                        <w:pPr>
+                          <w:spacing w:after="0"/>
+                          <w:jc w:val="center"/>
+                        </w:pPr>
+                      </w:p>
+                    </w:tc>
+                    <w:tc>
+                      <w:tcPr>
+                        <w:tcW w:type="dxa" w:w="432"/>
+                        <w:tcBorders>
+                          <w:top w:val="single" w:sz="8" w:color="4D730E"/>
+                          <w:left w:val="single" w:sz="8" w:color="4D730E"/>
+                          <w:bottom w:val="single" w:sz="8" w:color="4D730E"/>
+                          <w:right w:val="single" w:sz="8" w:color="4D730E"/>
+                        </w:tcBorders>
+                        <w:vAlign w:val="center"/>
+                        <w:tcMar>
+                          <w:top w:w="0" w:type="dxa"/>
+                          <w:left w:w="0" w:type="dxa"/>
+                          <w:bottom w:w="0" w:type="dxa"/>
+                          <w:right w:w="0" w:type="dxa"/>
+                        </w:tcMar>
+                      </w:tcPr>
+                      <w:p>
+                        <w:pPr>
+                          <w:spacing w:after="0"/>
+                          <w:jc w:val="center"/>
+                        </w:pPr>
+                      </w:p>
+                    </w:tc>
+                    <w:tc>
+                      <w:tcPr>
+                        <w:tcW w:type="dxa" w:w="432"/>
+                        <w:tcBorders>
+                          <w:top w:val="single" w:sz="8" w:color="4D730E"/>
+                          <w:left w:val="single" w:sz="8" w:color="4D730E"/>
+                          <w:bottom w:val="single" w:sz="8" w:color="4D730E"/>
+                          <w:right w:val="single" w:sz="8" w:color="4D730E"/>
+                        </w:tcBorders>
+                        <w:vAlign w:val="center"/>
+                        <w:tcMar>
+                          <w:top w:w="0" w:type="dxa"/>
+                          <w:left w:w="0" w:type="dxa"/>
+                          <w:bottom w:w="0" w:type="dxa"/>
+                          <w:right w:w="0" w:type="dxa"/>
+                        </w:tcMar>
+                      </w:tcPr>
+                      <w:p>
+                        <w:pPr>
+                          <w:spacing w:after="0"/>
+                          <w:jc w:val="center"/>
+                        </w:pPr>
+                      </w:p>
+                    </w:tc>
+                  </w:tr>
+                </w:tbl>
+                <w:p>
+                  <w:pPr>
+                    <w:spacing w:before="0" w:after="0" w:line="20" w:lineRule="exact"/>
+                  </w:pPr>
+                </w:p>
+              </w:tc>
+            </w:tr>
+            <w:tr>
+              <w:trPr>
+                <w:cantSplit/>
+                <w:trHeight w:val="633" w:hRule="atLeast"/>
+              </w:trPr>
+              <w:tc>
+                <w:tcPr>
+                  <w:tcW w:type="dxa" w:w="864"/>
+                  <w:vAlign w:val="center"/>
+                  <w:tcMar>
+                    <w:top w:w="20" w:type="dxa"/>
+                    <w:left w:w="20" w:type="dxa"/>
+                    <w:bottom w:w="20" w:type="dxa"/>
+                    <w:right w:w="20" w:type="dxa"/>
+                  </w:tcMar>
+                  <w:tcBorders>
+                    <w:bottom w:val="single" w:sz="4" w:color="C8CDC2"/>
+                  </w:tcBorders>
+                </w:tcPr>
+                <w:p>
+                  <w:pPr>
+                    <w:spacing w:after="0"/>
+                  </w:pPr>
+                  <w:r>
+                    <w:rPr>
+                      <w:rFonts w:ascii="Trade Gothic Next" w:hAnsi="Trade Gothic Next"/>
+                      <w:b/>
+                      <w:color w:val="14161B"/>
+                      <w:sz w:val="22"/>
+                      <w:u w:val="none"/>
+                    </w:rPr>
+                    <w:t>Cl</w:t>
+                  </w:r>
+                </w:p>
+              </w:tc>
+              <w:tc>
+                <w:tcPr>
+                  <w:tcW w:type="dxa" w:w="9216"/>
+                  <w:vAlign w:val="center"/>
+                  <w:tcMar>
+                    <w:top w:w="20" w:type="dxa"/>
+                    <w:left w:w="20" w:type="dxa"/>
+                    <w:bottom w:w="20" w:type="dxa"/>
+                    <w:right w:w="20" w:type="dxa"/>
+                  </w:tcMar>
+                  <w:tcBorders>
+                    <w:bottom w:val="single" w:sz="4" w:color="C8CDC2"/>
+                  </w:tcBorders>
+                </w:tcPr>
+                <w:p>
+                  <w:pPr>
+                    <w:spacing w:before="0" w:after="0" w:line="20" w:lineRule="exact"/>
+                  </w:pPr>
+                </w:p>
+                <w:tbl>
+                  <w:tblPr>
+                    <w:tblW w:type="auto" w:w="0"/>
+                    <w:tblLayout w:type="fixed"/>
+                    <w:tblLook w:firstColumn="1" w:firstRow="1" w:lastColumn="0" w:lastRow="0" w:noHBand="0" w:noVBand="1" w:val="04A0"/>
+                    <w:tblLayout w:type="fixed"/>
+                  </w:tblPr>
+                  <w:tblGrid>
+                    <w:gridCol w:w="490"/>
+                    <w:gridCol w:w="432"/>
+                    <w:gridCol w:w="490"/>
+                    <w:gridCol w:w="432"/>
+                    <w:gridCol w:w="432"/>
+                    <w:gridCol w:w="432"/>
+                  </w:tblGrid>
+                  <w:tr>
+                    <w:trPr>
+                      <w:cantSplit/>
+                      <w:trHeight w:val="489" w:hRule="atLeast"/>
+                    </w:trPr>
+                    <w:tc>
+                      <w:tcPr>
+                        <w:tcW w:type="dxa" w:w="490"/>
+                        <w:vAlign w:val="center"/>
+                        <w:tcMar>
+                          <w:top w:w="0" w:type="dxa"/>
+                          <w:left w:w="0" w:type="dxa"/>
+                          <w:bottom w:w="0" w:type="dxa"/>
+                          <w:right w:w="10" w:type="dxa"/>
+                        </w:tcMar>
+                      </w:tcPr>
+                      <w:p>
+                        <w:pPr>
+                          <w:spacing w:after="0"/>
+                          <w:jc w:val="right"/>
+                        </w:pPr>
+                        <w:r>
+                          <w:rPr>
+                            <w:rFonts w:ascii="Trade Gothic Next" w:hAnsi="Trade Gothic Next"/>
+                            <w:b/>
+                            <w:color w:val="55604F"/>
+                            <w:sz w:val="16"/>
+                            <w:u w:val="none"/>
+                          </w:rPr>
+                          <w:t>3s</w:t>
+                        </w:r>
+                      </w:p>
+                    </w:tc>
+                    <w:tc>
+                      <w:tcPr>
+                        <w:tcW w:type="dxa" w:w="432"/>
+                        <w:tcBorders>
+                          <w:top w:val="single" w:sz="8" w:color="4D730E"/>
+                          <w:left w:val="single" w:sz="8" w:color="4D730E"/>
+                          <w:bottom w:val="single" w:sz="8" w:color="4D730E"/>
+                          <w:right w:val="single" w:sz="8" w:color="4D730E"/>
+                        </w:tcBorders>
+                        <w:vAlign w:val="center"/>
+                        <w:tcMar>
+                          <w:top w:w="0" w:type="dxa"/>
+                          <w:left w:w="0" w:type="dxa"/>
+                          <w:bottom w:w="0" w:type="dxa"/>
+                          <w:right w:w="0" w:type="dxa"/>
+                        </w:tcMar>
+                      </w:tcPr>
+                      <w:p>
+                        <w:pPr>
+                          <w:spacing w:after="0"/>
+                          <w:jc w:val="center"/>
+                        </w:pPr>
+                      </w:p>
+                    </w:tc>
+                    <w:tc>
+                      <w:tcPr>
+                        <w:tcW w:type="dxa" w:w="490"/>
+                        <w:vAlign w:val="center"/>
+                        <w:tcMar>
+                          <w:top w:w="0" w:type="dxa"/>
+                          <w:left w:w="0" w:type="dxa"/>
+                          <w:bottom w:w="0" w:type="dxa"/>
+                          <w:right w:w="10" w:type="dxa"/>
+                        </w:tcMar>
+                      </w:tcPr>
+                      <w:p>
+                        <w:pPr>
+                          <w:spacing w:after="0"/>
+                          <w:jc w:val="right"/>
+                        </w:pPr>
+                        <w:r>
+                          <w:rPr>
+                            <w:rFonts w:ascii="Trade Gothic Next" w:hAnsi="Trade Gothic Next"/>
+                            <w:b/>
+                            <w:color w:val="55604F"/>
+                            <w:sz w:val="16"/>
+                            <w:u w:val="none"/>
+                          </w:rPr>
+                          <w:t>3p</w:t>
+                        </w:r>
+                      </w:p>
+                    </w:tc>
+                    <w:tc>
+                      <w:tcPr>
+                        <w:tcW w:type="dxa" w:w="432"/>
+                        <w:tcBorders>
+                          <w:top w:val="single" w:sz="8" w:color="4D730E"/>
+                          <w:left w:val="single" w:sz="8" w:color="4D730E"/>
+                          <w:bottom w:val="single" w:sz="8" w:color="4D730E"/>
+                          <w:right w:val="single" w:sz="8" w:color="4D730E"/>
+                        </w:tcBorders>
+                        <w:vAlign w:val="center"/>
+                        <w:tcMar>
+                          <w:top w:w="0" w:type="dxa"/>
+                          <w:left w:w="0" w:type="dxa"/>
+                          <w:bottom w:w="0" w:type="dxa"/>
+                          <w:right w:w="0" w:type="dxa"/>
+                        </w:tcMar>
+                      </w:tcPr>
+                      <w:p>
+                        <w:pPr>
+                          <w:spacing w:after="0"/>
+                          <w:jc w:val="center"/>
+                        </w:pPr>
+                      </w:p>
+                    </w:tc>
+                    <w:tc>
+                      <w:tcPr>
+                        <w:tcW w:type="dxa" w:w="432"/>
+                        <w:tcBorders>
+                          <w:top w:val="single" w:sz="8" w:color="4D730E"/>
+                          <w:left w:val="single" w:sz="8" w:color="4D730E"/>
+                          <w:bottom w:val="single" w:sz="8" w:color="4D730E"/>
+                          <w:right w:val="single" w:sz="8" w:color="4D730E"/>
+                        </w:tcBorders>
+                        <w:vAlign w:val="center"/>
+                        <w:tcMar>
+                          <w:top w:w="0" w:type="dxa"/>
+                          <w:left w:w="0" w:type="dxa"/>
+                          <w:bottom w:w="0" w:type="dxa"/>
+                          <w:right w:w="0" w:type="dxa"/>
+                        </w:tcMar>
+                      </w:tcPr>
+                      <w:p>
+                        <w:pPr>
+                          <w:spacing w:after="0"/>
+                          <w:jc w:val="center"/>
+                        </w:pPr>
+                      </w:p>
+                    </w:tc>
+                    <w:tc>
+                      <w:tcPr>
+                        <w:tcW w:type="dxa" w:w="432"/>
+                        <w:tcBorders>
+                          <w:top w:val="single" w:sz="8" w:color="4D730E"/>
+                          <w:left w:val="single" w:sz="8" w:color="4D730E"/>
+                          <w:bottom w:val="single" w:sz="8" w:color="4D730E"/>
+                          <w:right w:val="single" w:sz="8" w:color="4D730E"/>
+                        </w:tcBorders>
+                        <w:vAlign w:val="center"/>
+                        <w:tcMar>
+                          <w:top w:w="0" w:type="dxa"/>
+                          <w:left w:w="0" w:type="dxa"/>
+                          <w:bottom w:w="0" w:type="dxa"/>
+                          <w:right w:w="0" w:type="dxa"/>
+                        </w:tcMar>
+                      </w:tcPr>
+                      <w:p>
+                        <w:pPr>
+                          <w:spacing w:after="0"/>
+                          <w:jc w:val="center"/>
+                        </w:pPr>
+                      </w:p>
+                    </w:tc>
+                  </w:tr>
+                </w:tbl>
+                <w:p>
+                  <w:pPr>
+                    <w:spacing w:before="0" w:after="0" w:line="20" w:lineRule="exact"/>
+                  </w:pPr>
+                </w:p>
+              </w:tc>
+            </w:tr>
+          </w:tbl>
+          <w:p>
+            <w:pPr>
+              <w:spacing w:before="0" w:after="0" w:line="20" w:lineRule="exact"/>
+            </w:pPr>
+          </w:p>
+          <w:p>
+            <w:pPr>
+              <w:spacing w:before="0" w:after="0" w:line="60" w:lineRule="exact"/>
+            </w:pPr>
+            <w:r>
+              <w:rPr>
+                <w:rFonts w:ascii="Trade Gothic Next" w:hAnsi="Trade Gothic Next"/>
+                <w:sz w:val="2"/>
+              </w:rPr>
+            </w:r>
+          </w:p>
+          <w:p>
+            <w:pPr>
+              <w:spacing w:after="40"/>
+              <w:ind w:left="360" w:hanging="360"/>
+            </w:pPr>
+            <w:r>
+              <w:rPr>
+                <w:rFonts w:ascii="Trade Gothic Next" w:hAnsi="Trade Gothic Next"/>
+                <w:b w:val="0"/>
+                <w:color w:val="14161B"/>
+                <w:sz w:val="20"/>
+                <w:u w:val="none"/>
+              </w:rPr>
+              <w:t xml:space="preserve">7   Which of the three has the most unpaired electrons?  </w:t>
+            </w:r>
+            <w:r>
+              <w:rPr>
+                <w:rFonts w:ascii="Trade Gothic Next" w:hAnsi="Trade Gothic Next"/>
+                <w:b w:val="0"/>
+                <w:color w:val="14161B"/>
+                <w:sz w:val="20"/>
+                <w:u w:val="none"/>
+              </w:rPr>
+              <w:t xml:space="preserve"> ______ </w:t>
+            </w:r>
+            <w:r>
+              <w:rPr>
+                <w:rFonts w:ascii="Trade Gothic Next" w:hAnsi="Trade Gothic Next"/>
+                <w:b w:val="0"/>
+                <w:color w:val="14161B"/>
+                <w:sz w:val="20"/>
+                <w:u w:val="none"/>
+              </w:rPr>
+              <w:t xml:space="preserve">   How many?  </w:t>
+            </w:r>
+            <w:r>
+              <w:rPr>
+                <w:rFonts w:ascii="Trade Gothic Next" w:hAnsi="Trade Gothic Next"/>
+                <w:b w:val="0"/>
+                <w:color w:val="14161B"/>
+                <w:sz w:val="20"/>
+                <w:u w:val="none"/>
+              </w:rPr>
+              <w:t xml:space="preserve"> ______</w:t>
+            </w:r>
+          </w:p>
+          <w:p>
+            <w:pPr>
+              <w:spacing w:before="0" w:after="0" w:line="40" w:lineRule="exact"/>
+            </w:pPr>
+            <w:r>
+              <w:rPr>
+                <w:rFonts w:ascii="Trade Gothic Next" w:hAnsi="Trade Gothic Next"/>
+                <w:sz w:val="2"/>
+              </w:rPr>
+            </w:r>
           </w:p>
         </w:tc>
       </w:tr>

</xml_diff>